<commit_message>
Reconcile manuscript change-list against live Drive doc: verify anchors, add dropped-lambda edits (M-3b), Paperpile-citation note
Co-Authored-By: Claude Opus 4.8 (1M context) <noreply@anthropic.com>
</commit_message>
<xml_diff>
--- a/revision/manuscript_changes.docx
+++ b/revision/manuscript_changes.docx
@@ -150,6 +150,201 @@
     </w:p>
     <w:p>
       <w:pPr>
+        <w:pStyle w:val="BlockText"/>
+      </w:pPr>
+      <w:r>
+        <w:rPr>
+          <w:b/>
+          <w:bCs/>
+        </w:rPr>
+        <w:t xml:space="preserve">Reconciled against the live Google Doc (</w:t>
+      </w:r>
+      <w:r>
+        <w:rPr>
+          <w:b/>
+          <w:bCs/>
+        </w:rPr>
+        <w:t xml:space="preserve">“manuscript”</w:t>
+      </w:r>
+      <w:r>
+        <w:rPr>
+          <w:b/>
+          <w:bCs/>
+        </w:rPr>
+        <w:t xml:space="preserve">, 2026-06-03).</w:t>
+      </w:r>
+      <w:r>
+        <w:t xml:space="preserve"> </w:t>
+      </w:r>
+      <w:r>
+        <w:t xml:space="preserve">Every FIND anchor below</w:t>
+      </w:r>
+      <w:r>
+        <w:t xml:space="preserve"> </w:t>
+      </w:r>
+      <w:r>
+        <w:t xml:space="preserve">matches the document’s</w:t>
+      </w:r>
+      <w:r>
+        <w:t xml:space="preserve"> </w:t>
+      </w:r>
+      <w:r>
+        <w:rPr>
+          <w:i/>
+          <w:iCs/>
+        </w:rPr>
+        <w:t xml:space="preserve">visible</w:t>
+      </w:r>
+      <w:r>
+        <w:t xml:space="preserve"> </w:t>
+      </w:r>
+      <w:r>
+        <w:t xml:space="preserve">text; the equations are present as the same plain text shown</w:t>
+      </w:r>
+      <w:r>
+        <w:t xml:space="preserve"> </w:t>
+      </w:r>
+      <w:r>
+        <w:t xml:space="preserve">(e.g. </w:t>
+      </w:r>
+      <w:r>
+        <w:rPr>
+          <w:rStyle w:val="VerbatimChar"/>
+        </w:rPr>
+        <w:t xml:space="preserve">wfi=exp(-dfi Tdepth)</w:t>
+      </w:r>
+      <w:r>
+        <w:t xml:space="preserve">,</w:t>
+      </w:r>
+      <w:r>
+        <w:t xml:space="preserve"> </w:t>
+      </w:r>
+      <w:r>
+        <w:rPr>
+          <w:rStyle w:val="VerbatimChar"/>
+        </w:rPr>
+        <w:t xml:space="preserve">Priority = SeqDefmedian2GE</w:t>
+      </w:r>
+      <w:r>
+        <w:t xml:space="preserve">), so the find/replace works directly.</w:t>
+      </w:r>
+      <w:r>
+        <w:t xml:space="preserve"> </w:t>
+      </w:r>
+      <w:r>
+        <w:t xml:space="preserve">Two formatting notes: (a) citations are</w:t>
+      </w:r>
+      <w:r>
+        <w:t xml:space="preserve"> </w:t>
+      </w:r>
+      <w:r>
+        <w:rPr>
+          <w:b/>
+          <w:bCs/>
+        </w:rPr>
+        <w:t xml:space="preserve">Paperpile-managed links</w:t>
+      </w:r>
+      <w:r>
+        <w:t xml:space="preserve"> </w:t>
+      </w:r>
+      <w:r>
+        <w:t xml:space="preserve">(italic</w:t>
+      </w:r>
+      <w:r>
+        <w:t xml:space="preserve"> </w:t>
+      </w:r>
+      <w:r>
+        <w:rPr>
+          <w:i/>
+          <w:iCs/>
+        </w:rPr>
+        <w:t xml:space="preserve">et al.</w:t>
+      </w:r>
+      <w:r>
+        <w:t xml:space="preserve"> </w:t>
+      </w:r>
+      <w:r>
+        <w:t xml:space="preserve">+ hyperlink) —</w:t>
+      </w:r>
+      <w:r>
+        <w:t xml:space="preserve"> </w:t>
+      </w:r>
+      <w:r>
+        <w:t xml:space="preserve">when adding the new references (Soares 2023, Gumbs 2023, Kembel 2010) insert them</w:t>
+      </w:r>
+      <w:r>
+        <w:t xml:space="preserve"> </w:t>
+      </w:r>
+      <w:r>
+        <w:rPr>
+          <w:b/>
+          <w:bCs/>
+        </w:rPr>
+        <w:t xml:space="preserve">through</w:t>
+      </w:r>
+      <w:r>
+        <w:rPr>
+          <w:b/>
+          <w:bCs/>
+        </w:rPr>
+        <w:t xml:space="preserve"> </w:t>
+      </w:r>
+      <w:r>
+        <w:rPr>
+          <w:b/>
+          <w:bCs/>
+        </w:rPr>
+        <w:t xml:space="preserve">Paperpile</w:t>
+      </w:r>
+      <w:r>
+        <w:t xml:space="preserve"> </w:t>
+      </w:r>
+      <w:r>
+        <w:t xml:space="preserve">so they join the managed reference list, or add them manually and append the entries</w:t>
+      </w:r>
+      <w:r>
+        <w:t xml:space="preserve"> </w:t>
+      </w:r>
+      <w:r>
+        <w:t xml:space="preserve">from the</w:t>
+      </w:r>
+      <w:r>
+        <w:t xml:space="preserve"> </w:t>
+      </w:r>
+      <w:r>
+        <w:t xml:space="preserve">“New references”</w:t>
+      </w:r>
+      <w:r>
+        <w:t xml:space="preserve"> </w:t>
+      </w:r>
+      <w:r>
+        <w:t xml:space="preserve">block; (b) the manuscript has lost several standalone</w:t>
+      </w:r>
+      <w:r>
+        <w:t xml:space="preserve"> </w:t>
+      </w:r>
+      <w:r>
+        <w:rPr>
+          <w:b/>
+          <w:bCs/>
+        </w:rPr>
+        <w:t xml:space="preserve">λ</w:t>
+      </w:r>
+      <w:r>
+        <w:t xml:space="preserve"> </w:t>
+      </w:r>
+      <w:r>
+        <w:t xml:space="preserve">glyphs — see</w:t>
+      </w:r>
+      <w:r>
+        <w:t xml:space="preserve"> </w:t>
+      </w:r>
+      <w:r>
+        <w:t xml:space="preserve">the consolidated Edit M-3b.</w:t>
+      </w:r>
+    </w:p>
+    <w:p>
+      <w:pPr>
         <w:pStyle w:val="FirstParagraph"/>
       </w:pPr>
       <w:r>
@@ -1229,6 +1424,238 @@
     <w:p>
       <w:pPr>
         <w:pStyle w:val="FirstParagraph"/>
+      </w:pPr>
+      <w:r>
+        <w:rPr>
+          <w:b/>
+          <w:bCs/>
+        </w:rPr>
+        <w:t xml:space="preserve">Edit M-3b [R1 #5 — dropped λ glyphs].</w:t>
+      </w:r>
+      <w:r>
+        <w:t xml:space="preserve"> </w:t>
+      </w:r>
+      <w:r>
+        <w:t xml:space="preserve">The live document has lost the standalone λ symbol in several</w:t>
+      </w:r>
+      <w:r>
+        <w:t xml:space="preserve"> </w:t>
+      </w:r>
+      <w:r>
+        <w:t xml:space="preserve">places (it renders as an empty</w:t>
+      </w:r>
+      <w:r>
+        <w:t xml:space="preserve"> </w:t>
+      </w:r>
+      <w:r>
+        <w:t xml:space="preserve">“()”</w:t>
+      </w:r>
+      <w:r>
+        <w:t xml:space="preserve"> </w:t>
+      </w:r>
+      <w:r>
+        <w:t xml:space="preserve">or a blank). Verified against the Drive doc — restore λ at each:</w:t>
+      </w:r>
+      <w:r>
+        <w:t xml:space="preserve"> </w:t>
+      </w:r>
+      <w:r>
+        <w:t xml:space="preserve">- Methods:</w:t>
+      </w:r>
+      <w:r>
+        <w:t xml:space="preserve"> </w:t>
+      </w:r>
+      <w:r>
+        <w:rPr>
+          <w:b/>
+          <w:bCs/>
+        </w:rPr>
+        <w:t xml:space="preserve">FIND</w:t>
+      </w:r>
+      <w:r>
+        <w:t xml:space="preserve"> </w:t>
+      </w:r>
+      <w:r>
+        <w:t xml:space="preserve">“scaled by , a user-specified decay parameter”</w:t>
+      </w:r>
+      <w:r>
+        <w:t xml:space="preserve"> </w:t>
+      </w:r>
+      <w:r>
+        <w:t xml:space="preserve">→</w:t>
+      </w:r>
+      <w:r>
+        <w:t xml:space="preserve"> </w:t>
+      </w:r>
+      <w:r>
+        <w:rPr>
+          <w:b/>
+          <w:bCs/>
+        </w:rPr>
+        <w:t xml:space="preserve">“scaled by λ, a user-specified decay parameter”</w:t>
+      </w:r>
+      <w:r>
+        <w:t xml:space="preserve"> </w:t>
+      </w:r>
+      <w:r>
+        <w:t xml:space="preserve">(same as M-2).</w:t>
+      </w:r>
+      <w:r>
+        <w:t xml:space="preserve"> </w:t>
+      </w:r>
+      <w:r>
+        <w:t xml:space="preserve">- Methods (kernel choice):</w:t>
+      </w:r>
+      <w:r>
+        <w:t xml:space="preserve"> </w:t>
+      </w:r>
+      <w:r>
+        <w:rPr>
+          <w:b/>
+          <w:bCs/>
+        </w:rPr>
+        <w:t xml:space="preserve">FIND</w:t>
+      </w:r>
+      <w:r>
+        <w:t xml:space="preserve"> </w:t>
+      </w:r>
+      <w:r>
+        <w:t xml:space="preserve">“the tunable decay parameter lambda (),”</w:t>
+      </w:r>
+      <w:r>
+        <w:t xml:space="preserve"> </w:t>
+      </w:r>
+      <w:r>
+        <w:t xml:space="preserve">→</w:t>
+      </w:r>
+      <w:r>
+        <w:t xml:space="preserve"> </w:t>
+      </w:r>
+      <w:r>
+        <w:rPr>
+          <w:b/>
+          <w:bCs/>
+        </w:rPr>
+        <w:t xml:space="preserve">“the tunable decay parameter λ,”</w:t>
+      </w:r>
+      <w:r>
+        <w:t xml:space="preserve"> </w:t>
+      </w:r>
+      <w:r>
+        <w:t xml:space="preserve">- Discussion (Practical Considerations):</w:t>
+      </w:r>
+      <w:r>
+        <w:t xml:space="preserve"> </w:t>
+      </w:r>
+      <w:r>
+        <w:rPr>
+          <w:b/>
+          <w:bCs/>
+        </w:rPr>
+        <w:t xml:space="preserve">FIND</w:t>
+      </w:r>
+      <w:r>
+        <w:t xml:space="preserve"> </w:t>
+      </w:r>
+      <w:r>
+        <w:t xml:space="preserve">“the choice of the decay parameter () dictates”</w:t>
+      </w:r>
+      <w:r>
+        <w:t xml:space="preserve"> </w:t>
+      </w:r>
+      <w:r>
+        <w:t xml:space="preserve">→</w:t>
+      </w:r>
+      <w:r>
+        <w:t xml:space="preserve"> </w:t>
+      </w:r>
+      <w:r>
+        <w:rPr>
+          <w:b/>
+          <w:bCs/>
+        </w:rPr>
+        <w:t xml:space="preserve">“the choice of the decay parameter λ dictates”</w:t>
+      </w:r>
+      <w:r>
+        <w:t xml:space="preserve"> </w:t>
+      </w:r>
+      <w:r>
+        <w:t xml:space="preserve">- Discussion (Practical Considerations):</w:t>
+      </w:r>
+      <w:r>
+        <w:t xml:space="preserve"> </w:t>
+      </w:r>
+      <w:r>
+        <w:rPr>
+          <w:b/>
+          <w:bCs/>
+        </w:rPr>
+        <w:t xml:space="preserve">FIND</w:t>
+      </w:r>
+      <w:r>
+        <w:t xml:space="preserve"> </w:t>
+      </w:r>
+      <w:r>
+        <w:t xml:space="preserve">“anchor to the genus-level phylogenetic half-life”</w:t>
+      </w:r>
+      <w:r>
+        <w:t xml:space="preserve"> </w:t>
+      </w:r>
+      <w:r>
+        <w:t xml:space="preserve">→</w:t>
+      </w:r>
+      <w:r>
+        <w:t xml:space="preserve"> </w:t>
+      </w:r>
+      <w:r>
+        <w:rPr>
+          <w:b/>
+          <w:bCs/>
+        </w:rPr>
+        <w:t xml:space="preserve">“anchor λ to the genus-level phylogenetic half-life”</w:t>
+      </w:r>
+      <w:r>
+        <w:t xml:space="preserve"> </w:t>
+      </w:r>
+      <w:r>
+        <w:rPr>
+          <w:i/>
+          <w:iCs/>
+        </w:rPr>
+        <w:t xml:space="preserve">(Tip: in Google Docs, searching the blank</w:t>
+      </w:r>
+      <w:r>
+        <w:rPr>
+          <w:i/>
+          <w:iCs/>
+        </w:rPr>
+        <w:t xml:space="preserve"> </w:t>
+      </w:r>
+      <w:r>
+        <w:rPr>
+          <w:i/>
+          <w:iCs/>
+        </w:rPr>
+        <w:t xml:space="preserve">“()”</w:t>
+      </w:r>
+      <w:r>
+        <w:rPr>
+          <w:i/>
+          <w:iCs/>
+        </w:rPr>
+        <w:t xml:space="preserve"> </w:t>
+      </w:r>
+      <w:r>
+        <w:rPr>
+          <w:i/>
+          <w:iCs/>
+        </w:rPr>
+        <w:t xml:space="preserve">is hard — search the surrounding words shown above.)</w:t>
+      </w:r>
+    </w:p>
+    <w:p>
+      <w:pPr>
+        <w:pStyle w:val="BodyText"/>
       </w:pPr>
       <w:r>
         <w:rPr>

</xml_diff>